<commit_message>
Aggiorna materiali con riferimenti normativi reali (L. 132/2025, D.Lgs 179-180/2026)
Aggiunto riferimenti-normativi.md con sintesi degli articoli applicabili
letti dai testi di legge forniti. Sostituiti i richiami generici nei
modelli operativi e nelle brochure con citazioni precise:
- Art. 41 D.Lgs 179/2026 (divieto decisioni automatizzate su rapporto
  di lavoro, nullita' del licenziamento in violazione)
- Art. 42 D.Lgs 179/2026 (formazione obbligatoria e aggiornamento DVR)
- Art. 11/13 Legge 132/2025 (informativa lavoratore, obblighi
  professioni intellettuali)
- Art. 47/49 D.Lgs 179/2026 (formazione continua obbligatoria per
  ordini professionali, equo compenso)
- Art. 17/18/19 D.Lgs 160/2026 (presunzione nesso causale, rilevanza
  della documentazione come prova in giudizio)

Co-Authored-By: Claude Sonnet 5 <noreply@anthropic.com>
Claude-Session: https://claude.ai/code/session_01WQ7cpz7SxLpGqocvcA6SUm
</commit_message>
<xml_diff>
--- a/consulenza-normativa-ai/modelli/02-checklist-pratiche-vietate-e-rischio.docx
+++ b/consulenza-normativa-ai/modelli/02-checklist-pratiche-vietate-e-rischio.docx
@@ -688,6 +688,35 @@
           <w:sz w:val="26"/>
           <w:szCs w:val="26"/>
         </w:rPr>
+        <w:t xml:space="preserve">Perché compilare questa checklist (non solo burocrazia)</w:t>
+      </w:r>
+    </w:p>
+    <w:p>
+      <w:pPr>
+        <w:spacing w:after="160"/>
+      </w:pPr>
+      <w:r>
+        <w:rPr>
+          <w:sz w:val="22"/>
+          <w:szCs w:val="22"/>
+        </w:rPr>
+        <w:t xml:space="preserve">In caso di contenzioso per danni da uso di un sistema IA, l’art. 18, D.Lgs 160/2026 presume il nesso di causalità tra la violazione di un obbligo del regolamento IA e il danno, salvo prova contraria a carico dell’azienda. L’art. 17 dello stesso decreto permette al giudice di ordinare l’esibizione dei registri di funzionamento e della documentazione di gestione del rischio. Questa checklist, insieme al censimento e alla policy, è la prova della diligenza dell’azienda: conservarla con cura.</w:t>
+      </w:r>
+    </w:p>
+    <w:p>
+      <w:pPr>
+        <w:pStyle w:val="Heading2"/>
+        <w:spacing w:after="100" w:before="280"/>
+      </w:pPr>
+      <w:r>
+        <w:rPr>
+          <w:rFonts w:ascii="Georgia" w:cs="Georgia" w:eastAsia="Georgia" w:hAnsi="Georgia"/>
+          <w:b/>
+          <w:bCs/>
+          <w:color w:val="16324F"/>
+          <w:sz w:val="26"/>
+          <w:szCs w:val="26"/>
+        </w:rPr>
         <w:t xml:space="preserve">Esito complessivo</w:t>
       </w:r>
     </w:p>

</xml_diff>